<commit_message>
add edit into docs file
</commit_message>
<xml_diff>
--- a/test.docx
+++ b/test.docx
@@ -78,6 +78,39 @@
           <w:lang w:val="en-US"/>
         </w:rPr>
         <w:t>Edit 6</w:t>
+      </w:r>
+    </w:p>
+    <w:p>
+      <w:pPr>
+        <w:rPr>
+          <w:lang w:val="en-US"/>
+        </w:rPr>
+      </w:pPr>
+    </w:p>
+    <w:p>
+      <w:pPr>
+        <w:rPr>
+          <w:lang w:val="en-US"/>
+        </w:rPr>
+      </w:pPr>
+      <w:r>
+        <w:rPr>
+          <w:lang w:val="en-US"/>
+        </w:rPr>
+        <w:t>Edit 7</w:t>
+      </w:r>
+    </w:p>
+    <w:p>
+      <w:pPr>
+        <w:rPr>
+          <w:lang w:val="en-US"/>
+        </w:rPr>
+      </w:pPr>
+      <w:r>
+        <w:rPr>
+          <w:lang w:val="en-US"/>
+        </w:rPr>
+        <w:t>Edit 9</w:t>
       </w:r>
     </w:p>
     <w:sectPr>

</xml_diff>